<commit_message>
chore(p3): sync Vietnamese bilingual record to corrected JED manuscript
Align 01_manuscript_vi (.md + rebuilt .docx) with the English _8500 set:
- Renumber exploratory DAI moderation H4 -> H3 (5 occurrences)
- Drop dissertation-framework sentence in section 2.3
- Exporter-only quadratic FSTS_c2 p-value .660 -> .730

Numbers (39.7% turning point) and Grammarly-only AI disclosure were
already correct. Deprecated jabs/mbr/thunderbird packages left untouched
(retained for history, not submitted). Docx rebuilt via pandoc with
figures embedded.

Co-Authored-By: Claude Opus 4.8 (1M context) <noreply@anthropic.com>
Claude-Session: https://claude.ai/code/session_01Xumaoraa2DLWLXsgJJ62oq
</commit_message>
<xml_diff>
--- a/p3/submission/jed_package/01_manuscript_vi.docx
+++ b/p3/submission/jed_package/01_manuscript_vi.docx
@@ -61,7 +61,40 @@
         <w:pStyle w:val="BodyText"/>
       </w:pPr>
       <w:r>
-        <w:t xml:space="preserve">Tính độc đáo/giá trị: Hình chữ U ngược trong bối cảnh nhiều giá trị không (zero-inflated) này phản ánh hiệu ứng rào cản tham gia hơn là sự bão hoà theo cường độ; các hệ số tầng 1 gộp che lấp quá trình lỗi thời tăng dần của biến đại diện. Cụm điểm ngoặt gắn với thể chế (39%–46% FSTS) chuyển trọng tâm tranh luận từ "quốc tế hoá có giúp ích không?" sang "trong điều kiện thể chế nào thì ngưỡng dịch chuyển?".</w:t>
+        <w:t xml:space="preserve">Tính độc đáo/giá trị: Hình chữ U ngược trong bối cảnh nhiều giá trị không (zero-inflated) này phản ánh hiệu ứng rào cản tham gia hơn là sự bão hoà theo cường độ; các hệ số tầng 1 gộp che lấp quá trình lỗi thời tăng dần của biến đại diện. Cụm điểm ngoặt gắn với thể chế (39%–46% FSTS) chuyển trọng tâm tranh luận từ</w:t>
+      </w:r>
+      <w:r>
+        <w:t xml:space="preserve"> </w:t>
+      </w:r>
+      <w:r>
+        <w:t xml:space="preserve">“</w:t>
+      </w:r>
+      <w:r>
+        <w:t xml:space="preserve">quốc tế hoá có giúp ích không?</w:t>
+      </w:r>
+      <w:r>
+        <w:t xml:space="preserve">”</w:t>
+      </w:r>
+      <w:r>
+        <w:t xml:space="preserve"> </w:t>
+      </w:r>
+      <w:r>
+        <w:t xml:space="preserve">sang</w:t>
+      </w:r>
+      <w:r>
+        <w:t xml:space="preserve"> </w:t>
+      </w:r>
+      <w:r>
+        <w:t xml:space="preserve">“</w:t>
+      </w:r>
+      <w:r>
+        <w:t xml:space="preserve">trong điều kiện thể chế nào thì ngưỡng dịch chuyển?</w:t>
+      </w:r>
+      <w:r>
+        <w:t xml:space="preserve">”</w:t>
+      </w:r>
+      <w:r>
+        <w:t xml:space="preserve">.</w:t>
       </w:r>
     </w:p>
     <w:p>
@@ -89,7 +122,7 @@
       </w:r>
     </w:p>
     <w:bookmarkEnd w:id="20"/>
-    <w:bookmarkStart w:id="21" w:name="X8291021638e5c0ee7b47a0aaabc4b853f1da348"/>
+    <w:bookmarkStart w:id="21" w:name="giới-thiệu"/>
     <w:p>
       <w:pPr>
         <w:pStyle w:val="Heading2"/>
@@ -283,7 +316,7 @@
       </w:r>
     </w:p>
     <w:bookmarkEnd w:id="21"/>
-    <w:bookmarkStart w:id="29" w:name="X05ef95b78b31c427f3190b04e65ba3eba048287"/>
+    <w:bookmarkStart w:id="29" w:name="cơ-sở-lý-thuyết-và-giả-thuyết"/>
     <w:p>
       <w:pPr>
         <w:pStyle w:val="Heading2"/>
@@ -292,7 +325,7 @@
         <w:t xml:space="preserve">2. Cơ sở lý thuyết và giả thuyết</w:t>
       </w:r>
     </w:p>
-    <w:bookmarkStart w:id="22" w:name="X27799ae45049c8a5130505151276ddbc596555a"/>
+    <w:bookmarkStart w:id="22" w:name="Xee49769103ace81c364f77c9c00c86ff446e8e2"/>
     <w:p>
       <w:pPr>
         <w:pStyle w:val="Heading3"/>
@@ -402,7 +435,7 @@
       </w:r>
     </w:p>
     <w:bookmarkEnd w:id="22"/>
-    <w:bookmarkStart w:id="23" w:name="X693d7761e660017b0030ce2c3cb459e0903a67b"/>
+    <w:bookmarkStart w:id="23" w:name="Xc1bdd7a76c80d5f4a2f1fc026e0a6420d006bd6"/>
     <w:p>
       <w:pPr>
         <w:pStyle w:val="Heading3"/>
@@ -451,7 +484,7 @@
       </w:r>
     </w:p>
     <w:bookmarkEnd w:id="23"/>
-    <w:bookmarkStart w:id="24" w:name="X9926f6fdeb2563ca16dc9ee150e247403451c38"/>
+    <w:bookmarkStart w:id="24" w:name="Xa3eb9fc796eff7ce445b60add5e4a180e23d92e"/>
     <w:p>
       <w:pPr>
         <w:pStyle w:val="Heading3"/>
@@ -547,11 +580,11 @@
         <w:t xml:space="preserve">không được hình thức hoá thành một cấu trúc mang giả thuyết chính</w:t>
       </w:r>
       <w:r>
-        <w:t xml:space="preserve">; nó được giữ trong mọi đặc tả như một biến kiểm soát hiện diện số nền tảng, báo cáo mang tính mô tả. Do đó không có H3 nào được phát biểu ở đây; phép thăm dò điều tiết số mang tính khám phá tiếp sau (§2.4) được đánh số H4 để giữ tính nhất quán với khung luận án rộng hơn, trong đó H3 theo quy ước tương ứng với điều tiết thể chế trong các bài đa quốc gia.</w:t>
+        <w:t xml:space="preserve">; nó được giữ trong mọi đặc tả như một biến kiểm soát hiện diện số nền tảng, báo cáo mang tính mô tả. Do đó phép thăm dò điều tiết số mang tính khám phá tiếp sau (Mục 2.4) được đánh số H3.</w:t>
       </w:r>
     </w:p>
     <w:bookmarkEnd w:id="24"/>
-    <w:bookmarkStart w:id="28" w:name="Xce6c9a7d1c5c7c35771643fb67f4c7850f13da7"/>
+    <w:bookmarkStart w:id="28" w:name="giá-trị-số-phụ-thuộc-giai-đoạn"/>
     <w:p>
       <w:pPr>
         <w:pStyle w:val="Heading3"/>
@@ -577,7 +610,7 @@
           <w:bCs/>
           <w:b/>
         </w:rPr>
-        <w:t xml:space="preserve">H4 (phép thăm dò khám phá, không phải giả thuyết chính).</w:t>
+        <w:t xml:space="preserve">H3 (phép thăm dò khám phá, không phải giả thuyết chính).</w:t>
       </w:r>
       <w:r>
         <w:t xml:space="preserve"> </w:t>
@@ -588,7 +621,7 @@
     </w:p>
     <w:p>
       <w:pPr>
-        <w:pStyle w:val="BodyText"/>
+        <w:pStyle w:val="CaptionedFigure"/>
       </w:pPr>
       <w:r>
         <w:drawing>
@@ -635,6 +668,14 @@
     </w:p>
     <w:p>
       <w:pPr>
+        <w:pStyle w:val="ImageCaption"/>
+      </w:pPr>
+      <w:r>
+        <w:t xml:space="preserve">Hình 1: Mô hình khái niệm</w:t>
+      </w:r>
+    </w:p>
+    <w:p>
+      <w:pPr>
         <w:pStyle w:val="BodyText"/>
       </w:pPr>
       <w:r>
@@ -661,12 +702,12 @@
         <w:t xml:space="preserve">et al.</w:t>
       </w:r>
       <w:r>
-        <w:t xml:space="preserve">, 1997). H2 đặc tả năng lực công nghệ (TCI_z; Lý thuyết dựa trên nguồn lực, Barney, 1991) như một tác động trực tiếp dịch chuyển mức và một biến điều tiết thứ cấp. H4 xem mức áp dụng dựa trên website (DAI_z, chỉ tầng 1) như một phép thăm dò khám phá của Lăng kính Năng lực Số (Banalieva and Dhanaraj, 2019). Các biến kiểm soát (ln quy mô doanh nghiệp, tuổi doanh nghiệp, sở hữu nước ngoài, hiệu ứng cố định ngành và đợt) nhập cộng tính. Dữ liệu: WBES 2009, 2015, 2023; N = 2,958 (gộp), n_đợt = 989/956/1,013.</w:t>
+        <w:t xml:space="preserve">, 1997). H2 đặc tả năng lực công nghệ (TCI_z; Lý thuyết dựa trên nguồn lực, Barney, 1991) như một tác động trực tiếp dịch chuyển mức và một biến điều tiết thứ cấp. H3 xem mức áp dụng dựa trên website (DAI_z, chỉ tầng 1) như một phép thăm dò khám phá của Lăng kính Năng lực Số (Banalieva and Dhanaraj, 2019). Các biến kiểm soát (ln quy mô doanh nghiệp, tuổi doanh nghiệp, sở hữu nước ngoài, hiệu ứng cố định ngành và đợt) nhập cộng tính. Dữ liệu: WBES 2009, 2015, 2023; N = 2,958 (gộp), n_đợt = 989/956/1,013.</w:t>
       </w:r>
     </w:p>
     <w:bookmarkEnd w:id="28"/>
     <w:bookmarkEnd w:id="29"/>
-    <w:bookmarkStart w:id="35" w:name="X9625864dada8107383b4a16f8e95c829edc6c27"/>
+    <w:bookmarkStart w:id="35" w:name="X6cd01f3f93342cb6b133880f2af4f5075c693ce"/>
     <w:p>
       <w:pPr>
         <w:pStyle w:val="Heading2"/>
@@ -675,7 +716,7 @@
         <w:t xml:space="preserve">3. Dữ liệu, biến số, và chiến lược thực nghiệm</w:t>
       </w:r>
     </w:p>
-    <w:bookmarkStart w:id="30" w:name="Xe2cb903402e003c83e737f7cc4a1dae6c613e85"/>
+    <w:bookmarkStart w:id="30" w:name="cấu-trúc-dữ-liệu"/>
     <w:p>
       <w:pPr>
         <w:pStyle w:val="Heading3"/>
@@ -693,7 +734,7 @@
       </w:r>
     </w:p>
     <w:bookmarkEnd w:id="30"/>
-    <w:bookmarkStart w:id="31" w:name="X4ccc2fb137c87b79d1e71cbfea6dc6e4b23640a"/>
+    <w:bookmarkStart w:id="31" w:name="biến-số"/>
     <w:p>
       <w:pPr>
         <w:pStyle w:val="Heading3"/>
@@ -719,7 +760,7 @@
       </w:r>
     </w:p>
     <w:bookmarkEnd w:id="31"/>
-    <w:bookmarkStart w:id="32" w:name="X8642aea1e604fb368b9205dd294c100b0dc6e7e"/>
+    <w:bookmarkStart w:id="32" w:name="chuỗi-mô-hình"/>
     <w:p>
       <w:pPr>
         <w:pStyle w:val="Heading3"/>
@@ -775,7 +816,7 @@
         <w:t xml:space="preserve">X</w:t>
       </w:r>
       <w:r>
-        <w:t xml:space="preserve">_it là các biến kiểm soát (lnEmp, FirmAge, ForeignOwned), δ_s là hiệu ứng cố định ngành, và λ_t là hiệu ứng cố định đợt (chỉ trong mô hình gộp). M0 là các biến kiểm soát nền; M1 thêm FSTS_c (tuyến tính); M2 thêm FSTS_c² (kiểm định H1, đòi hỏi β₁ &gt; 0, β₂ &lt; 0, với điểm ngoặt TP* = −β₁/(2β₂) được xác nhận bằng kiểm định u của Lind–Mehlum (2010)); M3 thêm TCI_z và các tương tác FSTS của nó (kiểm định H2); M4 thêm DAI_z và các tương tác FSTS của nó (H4 khám phá); M5 và M6 nhập TCI_z và DAI_z chỉ như tác động trực tiếp; M7 là mô hình hai-trực-tiếp không tương tác; M8 là mô hình đầy đủ (hai-trực-tiếp cộng điều tiết DAI). Chuỗi M0–M8 được ước lượng theo từng đợt và trên tệp gộp, tạo ra bốn bộ ước lượng (2009, 2015, 2023, gộp). Xuyên suốt, kết quả được mô tả như các liên hệ (association) hơn là tác động (effect), nhất quán với giới hạn suy luận của dữ liệu lát cắt ngang lặp lại (Antonakis</w:t>
+        <w:t xml:space="preserve">_it là các biến kiểm soát (lnEmp, FirmAge, ForeignOwned), δ_s là hiệu ứng cố định ngành, và λ_t là hiệu ứng cố định đợt (chỉ trong mô hình gộp). M0 là các biến kiểm soát nền; M1 thêm FSTS_c (tuyến tính); M2 thêm FSTS_c² (kiểm định H1, đòi hỏi β₁ &gt; 0, β₂ &lt; 0, với điểm ngoặt TP* = −β₁/(2β₂) được xác nhận bằng kiểm định u của Lind–Mehlum (2010)); M3 thêm TCI_z và các tương tác FSTS của nó (kiểm định H2); M4 thêm DAI_z và các tương tác FSTS của nó (H3 khám phá); M5 và M6 nhập TCI_z và DAI_z chỉ như tác động trực tiếp; M7 là mô hình hai-trực-tiếp không tương tác; M8 là mô hình đầy đủ (hai-trực-tiếp cộng điều tiết DAI). Chuỗi M0–M8 được ước lượng theo từng đợt và trên tệp gộp, tạo ra bốn bộ ước lượng (2009, 2015, 2023, gộp). Xuyên suốt, kết quả được mô tả như các liên hệ (association) hơn là tác động (effect), nhất quán với giới hạn suy luận của dữ liệu lát cắt ngang lặp lại (Antonakis</w:t>
       </w:r>
       <w:r>
         <w:t xml:space="preserve"> </w:t>
@@ -792,7 +833,7 @@
       </w:r>
     </w:p>
     <w:bookmarkEnd w:id="32"/>
-    <w:bookmarkStart w:id="33" w:name="Xaffa7f4882c8db08de9b3ea58f8af7d820aee53"/>
+    <w:bookmarkStart w:id="33" w:name="nhận-dạng-và-nội-sinh"/>
     <w:p>
       <w:pPr>
         <w:pStyle w:val="Heading3"/>
@@ -823,7 +864,7 @@
       </w:r>
     </w:p>
     <w:bookmarkEnd w:id="33"/>
-    <w:bookmarkStart w:id="34" w:name="Xad36f696c4a8882228a774e3d4ccef218d0b35c"/>
+    <w:bookmarkStart w:id="34" w:name="tái-lập-và-khả-năng-tái-tạo"/>
     <w:p>
       <w:pPr>
         <w:pStyle w:val="Heading3"/>
@@ -871,7 +912,7 @@
     </w:p>
     <w:bookmarkEnd w:id="34"/>
     <w:bookmarkEnd w:id="35"/>
-    <w:bookmarkStart w:id="44" w:name="Xc1528237297c4ce8999628372a6b48494fd6214"/>
+    <w:bookmarkStart w:id="44" w:name="kết-quả"/>
     <w:p>
       <w:pPr>
         <w:pStyle w:val="Heading2"/>
@@ -896,7 +937,7 @@
         <w:t xml:space="preserve">[Chèn Bảng II vào đây]</w:t>
       </w:r>
     </w:p>
-    <w:bookmarkStart w:id="36" w:name="Xf3d6ceb3b570cc5cd95995f2b47f6035efbb788"/>
+    <w:bookmarkStart w:id="36" w:name="phát-hiện-theo-từng-đợt"/>
     <w:p>
       <w:pPr>
         <w:pStyle w:val="Heading3"/>
@@ -947,11 +988,11 @@
         <w:pStyle w:val="BodyText"/>
       </w:pPr>
       <w:r>
-        <w:t xml:space="preserve">Gộp lại, các kết quả theo đợt vạch ra hai liên hệ nhất quán với phụ thuộc giai đoạn. Năng lực công nghệ/tiêu chuẩn nước ngoài dương ở cả ba đợt với kích thước suy giảm vừa phải (TCI_z = 0.215 → 0.128 → 0.123) nhưng điều tiết vẫn tồn tại ở các panel 2009, 2023 và gộp. Hiện diện số dựa trên website đi theo một quỹ đạo phi đơn điệu (mạnh năm 2009, không ý nghĩa năm 2015, tái nổi lên năm 2023), và kênh điều tiết của nó chỉ hiện ra ở năm 2023. Một kiểm định tương tác đợt × biến trọng tâm gộp chính thức gợi ý rằng chỉ các dịch chuyển trực tiếp DAI là phân biệt được xuyên đợt, nên chúng tôi đọc mô thức như các liên hệ đặc thù theo đợt nhất quán với phụ thuộc giai đoạn hơn là một dịch chuyển cấu trúc được nhận dạng đầy đủ xuyên đợt.</w:t>
+        <w:t xml:space="preserve">Gộp lại, các kết quả theo đợt vạch ra hai liên hệ nhất quán với phụ thuộc giai đoạn. Năng lực công nghệ/tiêu chuẩn nước ngoài dương ở cả ba đợt với kích thước suy giảm vừa phải (TCI_z = 0.215 đến 0.128 đến 0.123) nhưng điều tiết vẫn tồn tại ở các panel 2009, 2023 và gộp. Hiện diện số dựa trên website đi theo một quỹ đạo phi đơn điệu (mạnh năm 2009, không ý nghĩa năm 2015, tái nổi lên năm 2023), và kênh điều tiết của nó chỉ hiện ra ở năm 2023. Một kiểm định tương tác đợt × biến trọng tâm gộp chính thức gợi ý rằng chỉ các dịch chuyển trực tiếp DAI là phân biệt được xuyên đợt, nên chúng tôi đọc mô thức như các liên hệ đặc thù theo đợt nhất quán với phụ thuộc giai đoạn hơn là một dịch chuyển cấu trúc được nhận dạng đầy đủ xuyên đợt.</w:t>
       </w:r>
     </w:p>
     <w:bookmarkEnd w:id="36"/>
-    <w:bookmarkStart w:id="40" w:name="Xd39f9c27da9271ef2f4cd20efce39375d68921a"/>
+    <w:bookmarkStart w:id="40" w:name="phát-hiện-gộp"/>
     <w:p>
       <w:pPr>
         <w:pStyle w:val="Heading3"/>
@@ -1007,7 +1048,7 @@
     </w:p>
     <w:p>
       <w:pPr>
-        <w:pStyle w:val="BodyText"/>
+        <w:pStyle w:val="CaptionedFigure"/>
       </w:pPr>
       <w:r>
         <w:drawing>
@@ -1054,6 +1095,14 @@
     </w:p>
     <w:p>
       <w:pPr>
+        <w:pStyle w:val="ImageCaption"/>
+      </w:pPr>
+      <w:r>
+        <w:t xml:space="preserve">Hình 2: Năng suất lao động dự báo theo FSTS, theo đợt và gộp</w:t>
+      </w:r>
+    </w:p>
+    <w:p>
+      <w:pPr>
         <w:pStyle w:val="BodyText"/>
       </w:pPr>
       <w:r>
@@ -1071,7 +1120,7 @@
       </w:r>
     </w:p>
     <w:bookmarkEnd w:id="40"/>
-    <w:bookmarkStart w:id="41" w:name="X78d4c366d6bfb1572651ffbbe35fe9d8afd2d69"/>
+    <w:bookmarkStart w:id="41" w:name="diễn-giải-các-kiểm-định-giả-thuyết"/>
     <w:p>
       <w:pPr>
         <w:pStyle w:val="Heading3"/>
@@ -1127,7 +1176,7 @@
         <w:pStyle w:val="BodyText"/>
       </w:pPr>
       <w:r>
-        <w:t xml:space="preserve">H4 nhận được sự ủng hộ khám phá hạn chế. Kiểm định điều tiết joint DAI không ý nghĩa ở 2009 (M4 p = .825) và 2015 (M4 p = .125) và đạt ngưỡng ý nghĩa ở 2023 (FSTS_c × DAI_z = -0.912, p = .043; M4 joint p = .102, M8 p = .062); kiểm định joint M8 gộp (p = .083) được dẫn dắt bởi đợt 2023. Theo Haans</w:t>
+        <w:t xml:space="preserve">H3 nhận được sự ủng hộ khám phá hạn chế. Kiểm định điều tiết joint DAI không ý nghĩa ở 2009 (M4 p = .825) và 2015 (M4 p = .125) và đạt ngưỡng ý nghĩa ở 2023 (FSTS_c × DAI_z = -0.912, p = .043; M4 joint p = .102, M8 p = .062); kiểm định joint M8 gộp (p = .083) được dẫn dắt bởi đợt 2023. Theo Haans</w:t>
       </w:r>
       <w:r>
         <w:t xml:space="preserve"> </w:t>
@@ -1155,7 +1204,7 @@
       </w:r>
     </w:p>
     <w:bookmarkEnd w:id="41"/>
-    <w:bookmarkStart w:id="42" w:name="X41b722d70da7a50b73503c4bc6b3f614ed958f5"/>
+    <w:bookmarkStart w:id="42" w:name="X6f885a7b064b1f2de0fc9c499a223178cbf5702"/>
     <w:p>
       <w:pPr>
         <w:pStyle w:val="Heading3"/>
@@ -1169,11 +1218,11 @@
         <w:pStyle w:val="FirstParagraph"/>
       </w:pPr>
       <w:r>
-        <w:t xml:space="preserve">Hình chữ U ngược toàn mẫu cung cấp thông tin về mô thức tham-gia-và-cường-độ kết hợp, nhưng độ cong của nó được nhận dạng chủ yếu qua biên tham gia: chỉ ~1.0% doanh nghiệp gộp nằm trong khoảng ±5 điểm phần trăm của các điểm ngoặt theo đợt, với phần lớn khối lượng nằm tại FSTS = 0. Khi tái khớp M2 / M7 / M8 trên mẫu con chỉ-gồm-xuất-khẩu (FSTS &gt; 0; gộp N = 669), số hạng tuyến tính FSTS_c âm (β = -0.861, p &lt; .001) nhưng số hạng bậc hai không ý nghĩa (FSTS_c² β = -0.200, p = .660; M8 joint p = .462). H1a (biên tham gia) do đó là biên liên quan đến năng suất chủ đạo; độ cong theo cường độ trong nội bộ nhóm xuất khẩu mà H1b tuyên bố suy yếu một khi biên tham gia được khử. Chúng tôi giữ hình chữ U ngược toàn mẫu như quy luật chủ đạo nhưng diễn giải nó tường minh qua lăng kính cơ chế kép: phần lớn chênh lệch năng suất nằm giữa doanh nghiệp không xuất khẩu và có xuất khẩu, với độ cong bổ sung hạn chế trong nội bộ nhóm xuất khẩu (các hệ số trọng tâm theo đợt và gộp được tóm tắt trong Bảng III).</w:t>
+        <w:t xml:space="preserve">Hình chữ U ngược toàn mẫu cung cấp thông tin về mô thức tham-gia-và-cường-độ kết hợp, nhưng độ cong của nó được nhận dạng chủ yếu qua biên tham gia: chỉ ~1.0% doanh nghiệp gộp nằm trong khoảng ±5 điểm phần trăm của các điểm ngoặt theo đợt, với phần lớn khối lượng nằm tại FSTS = 0. Khi tái khớp M2 / M7 / M8 trên mẫu con chỉ-gồm-xuất-khẩu (FSTS &gt; 0; gộp N = 669), số hạng tuyến tính FSTS_c âm (β = -0.861, p &lt; .001) nhưng số hạng bậc hai không ý nghĩa (FSTS_c² β = -0.200, p = .730; M8 joint p = .462). H1a (biên tham gia) do đó là biên liên quan đến năng suất chủ đạo; độ cong theo cường độ trong nội bộ nhóm xuất khẩu mà H1b tuyên bố suy yếu một khi biên tham gia được khử. Chúng tôi giữ hình chữ U ngược toàn mẫu như quy luật chủ đạo nhưng diễn giải nó tường minh qua lăng kính cơ chế kép: phần lớn chênh lệch năng suất nằm giữa doanh nghiệp không xuất khẩu và có xuất khẩu, với độ cong bổ sung hạn chế trong nội bộ nhóm xuất khẩu (các hệ số trọng tâm theo đợt và gộp được tóm tắt trong Bảng III).</w:t>
       </w:r>
     </w:p>
     <w:bookmarkEnd w:id="42"/>
-    <w:bookmarkStart w:id="43" w:name="X9e1a248961c6f9e508fa7c75dd01c1306eb820d"/>
+    <w:bookmarkStart w:id="43" w:name="phân-tích-vững"/>
     <w:p>
       <w:pPr>
         <w:pStyle w:val="Heading3"/>
@@ -1192,7 +1241,7 @@
     </w:p>
     <w:bookmarkEnd w:id="43"/>
     <w:bookmarkEnd w:id="44"/>
-    <w:bookmarkStart w:id="45" w:name="X3923f9545aa9c992e02ccb4472a40e02686b4e2"/>
+    <w:bookmarkStart w:id="45" w:name="thảo-luận"/>
     <w:p>
       <w:pPr>
         <w:pStyle w:val="Heading2"/>
@@ -1282,7 +1331,7 @@
       </w:r>
     </w:p>
     <w:bookmarkEnd w:id="45"/>
-    <w:bookmarkStart w:id="46" w:name="X034d0a9e594689c1c83bf20f4d68a2017baeb0a"/>
+    <w:bookmarkStart w:id="46" w:name="hạn-chế-và-hướng-nghiên-cứu-tiếp-theo"/>
     <w:p>
       <w:pPr>
         <w:pStyle w:val="Heading2"/>
@@ -1316,7 +1365,7 @@
       </w:r>
     </w:p>
     <w:bookmarkEnd w:id="46"/>
-    <w:bookmarkStart w:id="47" w:name="X1f9d67da4cff2359f332166e5b547113791cb62"/>
+    <w:bookmarkStart w:id="47" w:name="kết-luận"/>
     <w:p>
       <w:pPr>
         <w:pStyle w:val="Heading2"/>

</xml_diff>